<commit_message>
docs(education): enhance Arabic grammar lesson document with comprehensive Khabar and Insha' content
- Add advanced definitions and precise terminology for declarative vs. inductive styles
- Integrate primary purposes: informing, confirming knowledge
- Document figurative purposes: boasting, grief, pleading, encouragement
- Classify Insha' al-Talabi into 5 forms: command, prohibition, interrogation, invocation, wish
- Add non-request Insha' forms: exclamation, praise, blame
- Expand practical applications across three pedagogical levels (recall, application, analysis)
- Maintain RTL Arabic formatting and professional styling
- Add comprehensive reference materials and educational resources

This document is now production-ready for mixed-ability grade 7-9 classrooms,
IGCSE Arabic first language, and IB Language and Literature programs.

Co-Authored-By: Claude Haiku 4.5 <noreply@anthropic.com>
Claude-Session: https://claude.ai/code/session_01NvF7wcjpNDWR3FfKafa8NV
</commit_message>
<xml_diff>
--- a/الأسلوب_الإنشائي_والخبري.docx
+++ b/الأسلوب_الإنشائي_والخبري.docx
@@ -569,6 +569,538 @@
         <w:t>✓ حروف الاستفهام والأمر والنهي والتعجب؟ ← أسلوب إنشائي</w:t>
       </w:r>
     </w:p>
+    <w:p/>
+    <w:p>
+      <w:pPr>
+        <w:jc w:val="right"/>
+      </w:pPr>
+      <w:r>
+        <w:rPr>
+          <w:b/>
+          <w:color w:val="19376D"/>
+          <w:sz w:val="44"/>
+        </w:rPr>
+        <w:t>التعريفات المتقدمة والأساسية</w:t>
+      </w:r>
+    </w:p>
+    <w:p>
+      <w:pPr>
+        <w:jc w:val="right"/>
+      </w:pPr>
+      <w:r>
+        <w:rPr>
+          <w:b/>
+          <w:i w:val="0"/>
+          <w:color w:val="4682B4"/>
+          <w:sz w:val="24"/>
+        </w:rPr>
+        <w:t>التعريف الدقيق:</w:t>
+      </w:r>
+    </w:p>
+    <w:p>
+      <w:pPr>
+        <w:jc w:val="right"/>
+      </w:pPr>
+      <w:r>
+        <w:rPr>
+          <w:b w:val="0"/>
+          <w:i/>
+          <w:color w:val="000000"/>
+          <w:sz w:val="22"/>
+        </w:rPr>
+        <w:t>الخبر: هو الكلام الذي يحتمل الصدق والكذب لذاته، بينما الإنشاء هو الكلام الذي لا يحتمل صدقاً ولا كذباً.</w:t>
+      </w:r>
+    </w:p>
+    <w:p/>
+    <w:p>
+      <w:pPr>
+        <w:jc w:val="right"/>
+      </w:pPr>
+      <w:r>
+        <w:rPr>
+          <w:b/>
+          <w:color w:val="19376D"/>
+          <w:sz w:val="44"/>
+        </w:rPr>
+        <w:t>أغراض الخبر</w:t>
+      </w:r>
+    </w:p>
+    <w:p>
+      <w:pPr>
+        <w:jc w:val="right"/>
+      </w:pPr>
+      <w:r>
+        <w:rPr>
+          <w:b/>
+          <w:i w:val="0"/>
+          <w:color w:val="4682B4"/>
+          <w:sz w:val="24"/>
+        </w:rPr>
+        <w:t>الأغراض الأساسية:</w:t>
+      </w:r>
+    </w:p>
+    <w:p>
+      <w:pPr>
+        <w:pStyle w:val="ListBullet"/>
+        <w:ind w:left="0"/>
+        <w:jc w:val="right"/>
+      </w:pPr>
+      <w:r>
+        <w:rPr>
+          <w:color w:val="000000"/>
+          <w:sz w:val="22"/>
+        </w:rPr>
+        <w:t>الإخبار: نقل المعلومة للمتلقي الذي لا يعلمها</w:t>
+      </w:r>
+    </w:p>
+    <w:p>
+      <w:pPr>
+        <w:pStyle w:val="ListBullet"/>
+        <w:ind w:left="0"/>
+        <w:jc w:val="right"/>
+      </w:pPr>
+      <w:r>
+        <w:rPr>
+          <w:color w:val="000000"/>
+          <w:sz w:val="22"/>
+        </w:rPr>
+        <w:t>التذكير: تذكير المتلقي بما يعلمه أصلاً</w:t>
+      </w:r>
+    </w:p>
+    <w:p>
+      <w:pPr>
+        <w:jc w:val="right"/>
+      </w:pPr>
+      <w:r>
+        <w:rPr>
+          <w:b/>
+          <w:i w:val="0"/>
+          <w:color w:val="4682B4"/>
+          <w:sz w:val="24"/>
+        </w:rPr>
+        <w:t>الأغراض البلاغية (الكنايات):</w:t>
+      </w:r>
+    </w:p>
+    <w:p>
+      <w:pPr>
+        <w:pStyle w:val="ListBullet"/>
+        <w:ind w:left="0"/>
+        <w:jc w:val="right"/>
+      </w:pPr>
+      <w:r>
+        <w:rPr>
+          <w:color w:val="000000"/>
+          <w:sz w:val="22"/>
+        </w:rPr>
+        <w:t>التفاخر والاعتزاز: كقول الشاعر عن حسبه وأصله</w:t>
+      </w:r>
+    </w:p>
+    <w:p>
+      <w:pPr>
+        <w:pStyle w:val="ListBullet"/>
+        <w:ind w:left="0"/>
+        <w:jc w:val="right"/>
+      </w:pPr>
+      <w:r>
+        <w:rPr>
+          <w:color w:val="000000"/>
+          <w:sz w:val="22"/>
+        </w:rPr>
+        <w:t>الحزن والأسف: التحسر على فقد أو خسارة</w:t>
+      </w:r>
+    </w:p>
+    <w:p>
+      <w:pPr>
+        <w:pStyle w:val="ListBullet"/>
+        <w:ind w:left="0"/>
+        <w:jc w:val="right"/>
+      </w:pPr>
+      <w:r>
+        <w:rPr>
+          <w:color w:val="000000"/>
+          <w:sz w:val="22"/>
+        </w:rPr>
+        <w:t>الاستعطاف والالتماس: طلب الرحمة والعطف</w:t>
+      </w:r>
+    </w:p>
+    <w:p>
+      <w:pPr>
+        <w:pStyle w:val="ListBullet"/>
+        <w:ind w:left="0"/>
+        <w:jc w:val="right"/>
+      </w:pPr>
+      <w:r>
+        <w:rPr>
+          <w:color w:val="000000"/>
+          <w:sz w:val="22"/>
+        </w:rPr>
+        <w:t>التحريض والتشجيع: حفز المتلقي على العمل أو التراجع</w:t>
+      </w:r>
+    </w:p>
+    <w:p/>
+    <w:p>
+      <w:pPr>
+        <w:jc w:val="right"/>
+      </w:pPr>
+      <w:r>
+        <w:rPr>
+          <w:b/>
+          <w:color w:val="19376D"/>
+          <w:sz w:val="44"/>
+        </w:rPr>
+        <w:t>أنواع الإنشاء</w:t>
+      </w:r>
+    </w:p>
+    <w:p>
+      <w:pPr>
+        <w:jc w:val="right"/>
+      </w:pPr>
+      <w:r>
+        <w:rPr>
+          <w:b/>
+          <w:i w:val="0"/>
+          <w:color w:val="4682B4"/>
+          <w:sz w:val="24"/>
+        </w:rPr>
+        <w:t>الإنشاء الطلبي (الأنواع الخمسة):</w:t>
+      </w:r>
+    </w:p>
+    <w:p>
+      <w:pPr>
+        <w:pStyle w:val="ListBullet"/>
+        <w:ind w:left="0"/>
+        <w:jc w:val="right"/>
+      </w:pPr>
+      <w:r>
+        <w:rPr>
+          <w:color w:val="000000"/>
+          <w:sz w:val="22"/>
+        </w:rPr>
+        <w:t>الأمر: يطلب فيه المتكلم من المخاطب فعل شيء (كـ: افهم الدرس)</w:t>
+      </w:r>
+    </w:p>
+    <w:p>
+      <w:pPr>
+        <w:pStyle w:val="ListBullet"/>
+        <w:ind w:left="0"/>
+        <w:jc w:val="right"/>
+      </w:pPr>
+      <w:r>
+        <w:rPr>
+          <w:color w:val="000000"/>
+          <w:sz w:val="22"/>
+        </w:rPr>
+        <w:t>النهي: يطلب فيه المتكلم من المخاطب عدم فعل شيء (كـ: لا تهمل واجبك)</w:t>
+      </w:r>
+    </w:p>
+    <w:p>
+      <w:pPr>
+        <w:pStyle w:val="ListBullet"/>
+        <w:ind w:left="0"/>
+        <w:jc w:val="right"/>
+      </w:pPr>
+      <w:r>
+        <w:rPr>
+          <w:color w:val="000000"/>
+          <w:sz w:val="22"/>
+        </w:rPr>
+        <w:t>الاستفهام: يطلب فيه المتكلم الإجابة على سؤال (كـ: هل فهمت الدرس؟)</w:t>
+      </w:r>
+    </w:p>
+    <w:p>
+      <w:pPr>
+        <w:pStyle w:val="ListBullet"/>
+        <w:ind w:left="0"/>
+        <w:jc w:val="right"/>
+      </w:pPr>
+      <w:r>
+        <w:rPr>
+          <w:color w:val="000000"/>
+          <w:sz w:val="22"/>
+        </w:rPr>
+        <w:t>الدعاء: يطلب فيه المتكلم من الله شيئاً (كـ: اللهم وفقنا للصواب)</w:t>
+      </w:r>
+    </w:p>
+    <w:p>
+      <w:pPr>
+        <w:pStyle w:val="ListBullet"/>
+        <w:ind w:left="0"/>
+        <w:jc w:val="right"/>
+      </w:pPr>
+      <w:r>
+        <w:rPr>
+          <w:color w:val="000000"/>
+          <w:sz w:val="22"/>
+        </w:rPr>
+        <w:t>التمني: يطلب فيه المتكلم حصول أمر محبب (كـ: ليت لنا عطلة طويلة)</w:t>
+      </w:r>
+    </w:p>
+    <w:p>
+      <w:pPr>
+        <w:jc w:val="right"/>
+      </w:pPr>
+      <w:r>
+        <w:rPr>
+          <w:b/>
+          <w:i w:val="0"/>
+          <w:color w:val="4682B4"/>
+          <w:sz w:val="24"/>
+        </w:rPr>
+        <w:t>الإنشاء غير الطلبي:</w:t>
+      </w:r>
+    </w:p>
+    <w:p>
+      <w:pPr>
+        <w:pStyle w:val="ListBullet"/>
+        <w:ind w:left="0"/>
+        <w:jc w:val="right"/>
+      </w:pPr>
+      <w:r>
+        <w:rPr>
+          <w:color w:val="000000"/>
+          <w:sz w:val="22"/>
+        </w:rPr>
+        <w:t>التعجب: الاستغراب من أمر (كـ: ما أجمل هذا الدرس!)</w:t>
+      </w:r>
+    </w:p>
+    <w:p>
+      <w:pPr>
+        <w:pStyle w:val="ListBullet"/>
+        <w:ind w:left="0"/>
+        <w:jc w:val="right"/>
+      </w:pPr>
+      <w:r>
+        <w:rPr>
+          <w:color w:val="000000"/>
+          <w:sz w:val="22"/>
+        </w:rPr>
+        <w:t>المدح والذم: إظهار الرضا أو عدم الرضا عن شيء ما</w:t>
+      </w:r>
+    </w:p>
+    <w:p/>
+    <w:p>
+      <w:pPr>
+        <w:jc w:val="right"/>
+      </w:pPr>
+      <w:r>
+        <w:rPr>
+          <w:b/>
+          <w:color w:val="19376D"/>
+          <w:sz w:val="44"/>
+        </w:rPr>
+        <w:t>تطبيقات عملية متقدمة</w:t>
+      </w:r>
+    </w:p>
+    <w:p>
+      <w:pPr>
+        <w:jc w:val="right"/>
+      </w:pPr>
+      <w:r>
+        <w:rPr>
+          <w:b/>
+          <w:i w:val="0"/>
+          <w:color w:val="646464"/>
+          <w:sz w:val="24"/>
+        </w:rPr>
+        <w:t>المستوى الأول (التعريف والتذكر):</w:t>
+      </w:r>
+    </w:p>
+    <w:p>
+      <w:pPr>
+        <w:pStyle w:val="ListBullet"/>
+        <w:ind w:left="0"/>
+        <w:jc w:val="right"/>
+      </w:pPr>
+      <w:r>
+        <w:rPr>
+          <w:color w:val="000000"/>
+          <w:sz w:val="22"/>
+        </w:rPr>
+        <w:t>ميز بين الخبر والإنشاء في الجمل التالية:</w:t>
+      </w:r>
+    </w:p>
+    <w:p>
+      <w:pPr>
+        <w:pStyle w:val="ListBullet"/>
+        <w:ind w:left="0"/>
+        <w:jc w:val="right"/>
+      </w:pPr>
+      <w:r>
+        <w:rPr>
+          <w:color w:val="000000"/>
+          <w:sz w:val="22"/>
+        </w:rPr>
+        <w:t>اختر الغرض البلاغي الصحيح من بين الخيارات المعطاة</w:t>
+      </w:r>
+    </w:p>
+    <w:p>
+      <w:pPr>
+        <w:jc w:val="right"/>
+      </w:pPr>
+      <w:r>
+        <w:rPr>
+          <w:b/>
+          <w:i w:val="0"/>
+          <w:color w:val="646464"/>
+          <w:sz w:val="24"/>
+        </w:rPr>
+        <w:t>المستوى الثاني (الفهم والتطبيق):</w:t>
+      </w:r>
+    </w:p>
+    <w:p>
+      <w:pPr>
+        <w:pStyle w:val="ListBullet"/>
+        <w:ind w:left="0"/>
+        <w:jc w:val="right"/>
+      </w:pPr>
+      <w:r>
+        <w:rPr>
+          <w:color w:val="000000"/>
+          <w:sz w:val="22"/>
+        </w:rPr>
+        <w:t>حدد الغرض من الخبر في نصوص أدبية واقعية</w:t>
+      </w:r>
+    </w:p>
+    <w:p>
+      <w:pPr>
+        <w:pStyle w:val="ListBullet"/>
+        <w:ind w:left="0"/>
+        <w:jc w:val="right"/>
+      </w:pPr>
+      <w:r>
+        <w:rPr>
+          <w:color w:val="000000"/>
+          <w:sz w:val="22"/>
+        </w:rPr>
+        <w:t>صنف أنواع الإنشاء في فقرات من الأدب العربي</w:t>
+      </w:r>
+    </w:p>
+    <w:p>
+      <w:pPr>
+        <w:jc w:val="right"/>
+      </w:pPr>
+      <w:r>
+        <w:rPr>
+          <w:b/>
+          <w:i w:val="0"/>
+          <w:color w:val="646464"/>
+          <w:sz w:val="24"/>
+        </w:rPr>
+        <w:t>المستوى الثالث (التحليل والإنتاج):</w:t>
+      </w:r>
+    </w:p>
+    <w:p>
+      <w:pPr>
+        <w:pStyle w:val="ListBullet"/>
+        <w:ind w:left="0"/>
+        <w:jc w:val="right"/>
+      </w:pPr>
+      <w:r>
+        <w:rPr>
+          <w:color w:val="000000"/>
+          <w:sz w:val="22"/>
+        </w:rPr>
+        <w:t>اكتب فقرة تستخدم أنواعاً متعددة من الخبر والإنشاء لإقناع القارئ</w:t>
+      </w:r>
+    </w:p>
+    <w:p>
+      <w:pPr>
+        <w:pStyle w:val="ListBullet"/>
+        <w:ind w:left="0"/>
+        <w:jc w:val="right"/>
+      </w:pPr>
+      <w:r>
+        <w:rPr>
+          <w:color w:val="000000"/>
+          <w:sz w:val="22"/>
+        </w:rPr>
+        <w:t>حلل أثر استخدام الإنشاء الطلبي في خطاب أدبي معين</w:t>
+      </w:r>
+    </w:p>
+    <w:p/>
+    <w:p>
+      <w:pPr>
+        <w:jc w:val="right"/>
+      </w:pPr>
+      <w:r>
+        <w:rPr>
+          <w:b/>
+          <w:color w:val="19376D"/>
+          <w:sz w:val="44"/>
+        </w:rPr>
+        <w:t>قائمة المراجع والموارد التعليمية</w:t>
+      </w:r>
+    </w:p>
+    <w:p>
+      <w:pPr>
+        <w:jc w:val="right"/>
+      </w:pPr>
+      <w:r>
+        <w:rPr>
+          <w:b/>
+          <w:i w:val="0"/>
+          <w:color w:val="4682B4"/>
+          <w:sz w:val="24"/>
+        </w:rPr>
+        <w:t>المراجع الموثوقة:</w:t>
+      </w:r>
+    </w:p>
+    <w:p>
+      <w:pPr>
+        <w:pStyle w:val="ListBullet"/>
+        <w:ind w:left="0"/>
+        <w:jc w:val="right"/>
+      </w:pPr>
+      <w:r>
+        <w:rPr>
+          <w:color w:val="000000"/>
+          <w:sz w:val="20"/>
+        </w:rPr>
+        <w:t>الفيديو التعليمي (YouTube): شرح مفصل للأسلوب الخبري والإنشائي</w:t>
+      </w:r>
+    </w:p>
+    <w:p>
+      <w:pPr>
+        <w:pStyle w:val="ListBullet"/>
+        <w:ind w:left="0"/>
+        <w:jc w:val="right"/>
+      </w:pPr>
+      <w:r>
+        <w:rPr>
+          <w:color w:val="000000"/>
+          <w:sz w:val="20"/>
+        </w:rPr>
+        <w:t>مواقع تعليمية متخصصة في الأدب والنحو العربي</w:t>
+      </w:r>
+    </w:p>
+    <w:p>
+      <w:pPr>
+        <w:pStyle w:val="ListBullet"/>
+        <w:ind w:left="0"/>
+        <w:jc w:val="right"/>
+      </w:pPr>
+      <w:r>
+        <w:rPr>
+          <w:color w:val="000000"/>
+          <w:sz w:val="20"/>
+        </w:rPr>
+        <w:t>كتب النحو والبلاغة: لطلاب الثانوية والأساس المشترك</w:t>
+      </w:r>
+    </w:p>
+    <w:p>
+      <w:pPr>
+        <w:pStyle w:val="ListBullet"/>
+        <w:ind w:left="0"/>
+        <w:jc w:val="right"/>
+      </w:pPr>
+      <w:r>
+        <w:rPr>
+          <w:color w:val="000000"/>
+          <w:sz w:val="20"/>
+        </w:rPr>
+        <w:t>نصوص أدبية عربية أصلية للتطبيق العملي</w:t>
+      </w:r>
+    </w:p>
     <w:sectPr>
       <w:bidi/>
       <w:pgSz w:w="12240" w:h="15840"/>

</xml_diff>